<commit_message>
Add GitHub and YouTube links to CEN306 report and remove duplicate REPORT.md.
The official report (docx/pdf) now includes repository and demo video URLs on the cover and in the appendix.

Co-authored-by: Cursor <cursoragent@cursor.com>
</commit_message>
<xml_diff>
--- a/Omar Chat App/CEN306_OMAR_Chat_Project_Report.docx
+++ b/Omar Chat App/CEN306_OMAR_Chat_Project_Report.docx
@@ -1517,7 +1517,7 @@
                 <w:sz w:val="20"/>
                 <w:szCs w:val="20"/>
               </w:rPr>
-              <w:t xml:space="preserve">[Add repository URL]</w:t>
+              <w:t xml:space="preserve">https://github.com/om-ar-123/ChatApplication-Whatsapp-style.git</w:t>
             </w:r>
           </w:p>
         </w:tc>
@@ -1593,7 +1593,7 @@
                 <w:sz w:val="20"/>
                 <w:szCs w:val="20"/>
               </w:rPr>
-              <w:t xml:space="preserve">[Add YouTube link]</w:t>
+              <w:t xml:space="preserve">https://youtu.be/NMbdp9CBy3g</w:t>
             </w:r>
           </w:p>
         </w:tc>
@@ -38550,7 +38550,7 @@
                 <w:sz w:val="20"/>
                 <w:szCs w:val="20"/>
               </w:rPr>
-              <w:t xml:space="preserve">[Add repository URL]</w:t>
+              <w:t xml:space="preserve">https://github.com/om-ar-123/ChatApplication-Whatsapp-style.git</w:t>
             </w:r>
           </w:p>
         </w:tc>
@@ -38624,7 +38624,7 @@
                 <w:sz w:val="20"/>
                 <w:szCs w:val="20"/>
               </w:rPr>
-              <w:t xml:space="preserve">[Add YouTube URL]</w:t>
+              <w:t xml:space="preserve">https://youtu.be/NMbdp9CBy3g</w:t>
             </w:r>
           </w:p>
         </w:tc>

</xml_diff>